<commit_message>
Role change documentation, response code changes
added the segment about role changing in the documentation, also updated the role not found response message
</commit_message>
<xml_diff>
--- a/SA_SO_CSM_vizsgaremek_dokumentáció_minta2026.docx
+++ b/SA_SO_CSM_vizsgaremek_dokumentáció_minta2026.docx
@@ -4500,22 +4500,22 @@
         </w:numPr>
       </w:pPr>
       <w:r>
-        <w:t>Kosár és rendeléskezelési folyamat</w:t>
-      </w:r>
-    </w:p>
-    <w:p>
-      <w:pPr>
-        <w:rPr>
-          <w:rFonts w:cs="Times New Roman"/>
-          <w:szCs w:val="24"/>
-        </w:rPr>
-      </w:pPr>
-      <w:r>
-        <w:rPr>
-          <w:rFonts w:cs="Times New Roman"/>
-          <w:szCs w:val="24"/>
-        </w:rPr>
-        <w:t>A CartsController kezeli a kosárral kapcsolatos műveleteket. A POST /carts/AddProduct végpont egyszerre látja el a hozzáadás, mennyiségmódosítás és eltávolítás funkcióját. Minden végpont JWT tokenből olvassa ki a bejelentkezett felhasználó azonosítóját (User.Claims, "userId" claim), égy a kosár mindig az aktuális felhasználóhoz kötődik.</w:t>
+        <w:t>Felhasználói szerepkör módosítása</w:t>
+      </w:r>
+    </w:p>
+    <w:p>
+      <w:pPr>
+        <w:rPr>
+          <w:rFonts w:cs="Times New Roman"/>
+          <w:szCs w:val="24"/>
+        </w:rPr>
+      </w:pPr>
+      <w:r>
+        <w:rPr>
+          <w:rFonts w:cs="Times New Roman"/>
+          <w:szCs w:val="24"/>
+        </w:rPr>
+        <w:t>A rendszer lehetőséget biztosít a felhasználók jogosultsági szintjének módosítására. Ennek segítségével egy adott felhasználó szerepköre normál felhasználóról (User) adminisztrátorra (Admin) módosítható, illetve vissza is állítható.</w:t>
       </w:r>
     </w:p>
     <w:p>
@@ -4523,6 +4523,7 @@
         <w:rPr>
           <w:rFonts w:cs="Times New Roman"/>
           <w:b/>
+          <w:bCs/>
           <w:szCs w:val="24"/>
         </w:rPr>
       </w:pPr>
@@ -4530,69 +4531,50 @@
         <w:rPr>
           <w:rFonts w:cs="Times New Roman"/>
           <w:b/>
-          <w:szCs w:val="24"/>
-        </w:rPr>
-        <w:t>Termék hozzáadása a kosárhoz:</w:t>
-      </w:r>
-    </w:p>
-    <w:p>
-      <w:pPr>
-        <w:pStyle w:val="ListParagraph"/>
-        <w:numPr>
-          <w:ilvl w:val="0"/>
-          <w:numId w:val="20"/>
-        </w:numPr>
-        <w:rPr>
-          <w:rFonts w:cs="Times New Roman"/>
-          <w:szCs w:val="24"/>
-        </w:rPr>
-      </w:pPr>
-      <w:r>
-        <w:rPr>
-          <w:rFonts w:cs="Times New Roman"/>
-          <w:szCs w:val="24"/>
-        </w:rPr>
-        <w:t>A frontend POST kérést küld a /carts/AddProduct végpontra egy AddProductToCartDto objektummal (ProductId, Quantity). A backend betölti a bejelentkezett felhasználó kosárát eager loading-gal: CartProducts → Product → ProductSpecs → Spec és Category.</w:t>
-      </w:r>
-    </w:p>
-    <w:p>
-      <w:pPr>
-        <w:pStyle w:val="ListParagraph"/>
-        <w:numPr>
-          <w:ilvl w:val="0"/>
-          <w:numId w:val="20"/>
-        </w:numPr>
-        <w:rPr>
-          <w:rFonts w:cs="Times New Roman"/>
-          <w:szCs w:val="24"/>
-        </w:rPr>
-      </w:pPr>
-      <w:r>
-        <w:rPr>
-          <w:rFonts w:cs="Times New Roman"/>
-          <w:szCs w:val="24"/>
-        </w:rPr>
-        <w:t>A rendszer lekérdezi a kosárban lévő termék-azonosítókat (existingProductIds). Ha a termék már szerepel: Quantity &lt;= 0 esetén törli a CartProduct sort (eltávolítás), egyébként frissíti a mennyiséget. Ha a termék még nincs a kosárban: Quantity &lt;= 0 esetén 404-et ad vissza, egyébként új CartProduct sort szúr be az adatbázisba.</w:t>
-      </w:r>
-    </w:p>
-    <w:p>
-      <w:pPr>
-        <w:pStyle w:val="ListParagraph"/>
-        <w:numPr>
-          <w:ilvl w:val="0"/>
-          <w:numId w:val="20"/>
-        </w:numPr>
-        <w:rPr>
-          <w:rFonts w:cs="Times New Roman"/>
-          <w:szCs w:val="24"/>
-        </w:rPr>
-      </w:pPr>
-      <w:r>
-        <w:rPr>
-          <w:rFonts w:cs="Times New Roman"/>
-          <w:szCs w:val="24"/>
-        </w:rPr>
-        <w:t>Mindkét esetben a végpont 201 CreatedAtAction választ ad vissza, és a MapToDto() metódus a kosár tartalmát CartReadDto-vá alakítja: tartalmazza a kosárazonosítót, a felhasználó e-mail címét, és minden termékhez a mennyiséget, az árat, a speci-fikációkat és a kategória adatait.</w:t>
+          <w:bCs/>
+          <w:szCs w:val="24"/>
+        </w:rPr>
+        <w:t>A szerepkörök az alábbi módon vannak definiálva:</w:t>
+      </w:r>
+    </w:p>
+    <w:p>
+      <w:pPr>
+        <w:pStyle w:val="ListParagraph"/>
+        <w:numPr>
+          <w:ilvl w:val="0"/>
+          <w:numId w:val="12"/>
+        </w:numPr>
+        <w:rPr>
+          <w:rFonts w:cs="Times New Roman"/>
+          <w:szCs w:val="24"/>
+        </w:rPr>
+      </w:pPr>
+      <w:r>
+        <w:rPr>
+          <w:rFonts w:cs="Times New Roman"/>
+          <w:szCs w:val="24"/>
+        </w:rPr>
+        <w:t>1 – User (alapértelmezett felhasználó)</w:t>
+      </w:r>
+    </w:p>
+    <w:p>
+      <w:pPr>
+        <w:pStyle w:val="ListParagraph"/>
+        <w:numPr>
+          <w:ilvl w:val="0"/>
+          <w:numId w:val="12"/>
+        </w:numPr>
+        <w:rPr>
+          <w:rFonts w:cs="Times New Roman"/>
+          <w:szCs w:val="24"/>
+        </w:rPr>
+      </w:pPr>
+      <w:r>
+        <w:rPr>
+          <w:rFonts w:cs="Times New Roman"/>
+          <w:szCs w:val="24"/>
+        </w:rPr>
+        <w:t>2 – Admin (rendszergazda jogosultságok)</w:t>
       </w:r>
     </w:p>
     <w:p>
@@ -4600,6 +4582,7 @@
         <w:rPr>
           <w:rFonts w:cs="Times New Roman"/>
           <w:b/>
+          <w:bCs/>
           <w:szCs w:val="24"/>
         </w:rPr>
       </w:pPr>
@@ -4607,17 +4590,226 @@
         <w:rPr>
           <w:rFonts w:cs="Times New Roman"/>
           <w:b/>
-          <w:szCs w:val="24"/>
-        </w:rPr>
-        <w:t>Kosár lekérdezése:</w:t>
-      </w:r>
-    </w:p>
-    <w:p>
-      <w:pPr>
-        <w:pStyle w:val="ListParagraph"/>
-        <w:numPr>
-          <w:ilvl w:val="0"/>
-          <w:numId w:val="19"/>
+          <w:bCs/>
+          <w:szCs w:val="24"/>
+        </w:rPr>
+        <w:t>Elérési útvonal</w:t>
+      </w:r>
+    </w:p>
+    <w:p>
+      <w:pPr>
+        <w:rPr>
+          <w:rFonts w:cs="Times New Roman"/>
+          <w:szCs w:val="24"/>
+        </w:rPr>
+      </w:pPr>
+      <w:r>
+        <w:rPr>
+          <w:rFonts w:cs="Times New Roman"/>
+          <w:szCs w:val="24"/>
+        </w:rPr>
+        <w:t>A szerepkör módosítása egy backend API végponton keresztül történik:</w:t>
+      </w:r>
+    </w:p>
+    <w:p>
+      <w:pPr>
+        <w:pStyle w:val="ListParagraph"/>
+        <w:numPr>
+          <w:ilvl w:val="0"/>
+          <w:numId w:val="46"/>
+        </w:numPr>
+        <w:rPr>
+          <w:rFonts w:cs="Times New Roman"/>
+          <w:szCs w:val="24"/>
+        </w:rPr>
+      </w:pPr>
+      <w:r>
+        <w:rPr>
+          <w:rFonts w:cs="Times New Roman"/>
+          <w:szCs w:val="24"/>
+        </w:rPr>
+        <w:t>HTTP metódus: PUT</w:t>
+      </w:r>
+    </w:p>
+    <w:p>
+      <w:pPr>
+        <w:pStyle w:val="ListParagraph"/>
+        <w:numPr>
+          <w:ilvl w:val="0"/>
+          <w:numId w:val="46"/>
+        </w:numPr>
+        <w:rPr>
+          <w:rFonts w:cs="Times New Roman"/>
+          <w:szCs w:val="24"/>
+        </w:rPr>
+      </w:pPr>
+      <w:r>
+        <w:rPr>
+          <w:rFonts w:cs="Times New Roman"/>
+          <w:szCs w:val="24"/>
+        </w:rPr>
+        <w:t>Endpoint: /auth/changeRole</w:t>
+      </w:r>
+    </w:p>
+    <w:p>
+      <w:pPr>
+        <w:pStyle w:val="ListParagraph"/>
+        <w:numPr>
+          <w:ilvl w:val="0"/>
+          <w:numId w:val="46"/>
+        </w:numPr>
+        <w:rPr>
+          <w:rFonts w:cs="Times New Roman"/>
+          <w:szCs w:val="24"/>
+        </w:rPr>
+      </w:pPr>
+      <w:r>
+        <w:rPr>
+          <w:rFonts w:cs="Times New Roman"/>
+          <w:szCs w:val="24"/>
+        </w:rPr>
+        <w:t>Elérés: Swagger felületen keresztül</w:t>
+      </w:r>
+    </w:p>
+    <w:p>
+      <w:pPr>
+        <w:pStyle w:val="ListParagraph"/>
+        <w:numPr>
+          <w:ilvl w:val="0"/>
+          <w:numId w:val="46"/>
+        </w:numPr>
+        <w:rPr>
+          <w:rFonts w:cs="Times New Roman"/>
+          <w:szCs w:val="24"/>
+        </w:rPr>
+      </w:pPr>
+      <w:r>
+        <w:rPr>
+          <w:rFonts w:cs="Times New Roman"/>
+          <w:szCs w:val="24"/>
+        </w:rPr>
+        <w:t>Port: https://localhost:5000</w:t>
+      </w:r>
+    </w:p>
+    <w:p>
+      <w:pPr>
+        <w:pStyle w:val="ListParagraph"/>
+        <w:numPr>
+          <w:ilvl w:val="0"/>
+          <w:numId w:val="46"/>
+        </w:numPr>
+        <w:rPr>
+          <w:rFonts w:cs="Times New Roman"/>
+          <w:szCs w:val="24"/>
+        </w:rPr>
+      </w:pPr>
+      <w:r>
+        <w:rPr>
+          <w:rFonts w:cs="Times New Roman"/>
+          <w:szCs w:val="24"/>
+        </w:rPr>
+        <w:t>A végpont a Swagger UI segítségével könnyen tesztelhető a böngészőből.</w:t>
+      </w:r>
+    </w:p>
+    <w:p>
+      <w:pPr>
+        <w:rPr>
+          <w:rFonts w:cs="Times New Roman"/>
+          <w:b/>
+          <w:bCs/>
+          <w:szCs w:val="24"/>
+        </w:rPr>
+      </w:pPr>
+      <w:r>
+        <w:rPr>
+          <w:rFonts w:cs="Times New Roman"/>
+          <w:b/>
+          <w:bCs/>
+          <w:szCs w:val="24"/>
+        </w:rPr>
+        <w:t>Működés leírása</w:t>
+      </w:r>
+    </w:p>
+    <w:p>
+      <w:pPr>
+        <w:rPr>
+          <w:rFonts w:cs="Times New Roman"/>
+          <w:szCs w:val="24"/>
+        </w:rPr>
+      </w:pPr>
+      <w:r>
+        <w:rPr>
+          <w:rFonts w:cs="Times New Roman"/>
+          <w:szCs w:val="24"/>
+        </w:rPr>
+        <w:t>A végpont egy RoleChangeDto objektumot vár bemenetként, amely tartalmazza:</w:t>
+      </w:r>
+    </w:p>
+    <w:p>
+      <w:pPr>
+        <w:pStyle w:val="ListParagraph"/>
+        <w:numPr>
+          <w:ilvl w:val="0"/>
+          <w:numId w:val="47"/>
+        </w:numPr>
+        <w:rPr>
+          <w:rFonts w:cs="Times New Roman"/>
+          <w:szCs w:val="24"/>
+        </w:rPr>
+      </w:pPr>
+      <w:r>
+        <w:rPr>
+          <w:rFonts w:cs="Times New Roman"/>
+          <w:szCs w:val="24"/>
+        </w:rPr>
+        <w:t>a felhasználó e-mail címét (Email)</w:t>
+      </w:r>
+    </w:p>
+    <w:p>
+      <w:pPr>
+        <w:pStyle w:val="ListParagraph"/>
+        <w:numPr>
+          <w:ilvl w:val="0"/>
+          <w:numId w:val="47"/>
+        </w:numPr>
+        <w:rPr>
+          <w:rFonts w:cs="Times New Roman"/>
+          <w:szCs w:val="24"/>
+        </w:rPr>
+      </w:pPr>
+      <w:r>
+        <w:rPr>
+          <w:rFonts w:cs="Times New Roman"/>
+          <w:szCs w:val="24"/>
+        </w:rPr>
+        <w:t>az új szerepkör azonosítóját (RoleId)</w:t>
+      </w:r>
+    </w:p>
+    <w:p>
+      <w:pPr>
+        <w:rPr>
+          <w:rFonts w:cs="Times New Roman"/>
+          <w:b/>
+          <w:bCs/>
+          <w:szCs w:val="24"/>
+        </w:rPr>
+      </w:pPr>
+      <w:r>
+        <w:rPr>
+          <w:rFonts w:cs="Times New Roman"/>
+          <w:b/>
+          <w:bCs/>
+          <w:szCs w:val="24"/>
+        </w:rPr>
+        <w:t>Feldolgozás lépései:</w:t>
+      </w:r>
+    </w:p>
+    <w:p>
+      <w:pPr>
+        <w:pStyle w:val="ListParagraph"/>
+        <w:numPr>
+          <w:ilvl w:val="0"/>
+          <w:numId w:val="48"/>
         </w:numPr>
         <w:rPr>
           <w:rFonts w:cs="Times New Roman"/>
@@ -4630,67 +4822,441 @@
           <w:szCs w:val="24"/>
         </w:rPr>
         <w:lastRenderedPageBreak/>
-        <w:t>A GET /carts/Current végpont ([Authorize]) a JWT tokenből kiolvasott userId alapján kérdezi le a bejelentkezett felhasználó kosárát. A GET /carts/{id} végpont kosazöonsító alapján érheti el bárki a kosár adatait (például a rendelés megerősítése után), 404-et ad vissza, ha a kosár nem található.</w:t>
-      </w:r>
-    </w:p>
-    <w:p>
-      <w:pPr>
-        <w:pStyle w:val="ListParagraph"/>
-        <w:numPr>
-          <w:ilvl w:val="0"/>
-          <w:numId w:val="19"/>
-        </w:numPr>
-        <w:rPr>
-          <w:rFonts w:cs="Times New Roman"/>
-          <w:szCs w:val="24"/>
-        </w:rPr>
-      </w:pPr>
-      <w:r>
-        <w:rPr>
-          <w:rFonts w:cs="Times New Roman"/>
-          <w:szCs w:val="24"/>
-        </w:rPr>
-        <w:t>A GET /carts végpont az összes kosár adatait adja vissza (adminisztrációs célra). Mindkét lekérdező végpont ugyanazt a többszintű eager loading-ot alkalmazza: CartProducts → Product → ProductSpecs → Spec, és az eredményt CartReadDto-ként adja vissza.</w:t>
-      </w:r>
-    </w:p>
-    <w:p>
-      <w:pPr>
-        <w:pStyle w:val="ListParagraph"/>
-        <w:numPr>
-          <w:ilvl w:val="0"/>
-          <w:numId w:val="19"/>
-        </w:numPr>
-        <w:rPr>
-          <w:rFonts w:cs="Times New Roman"/>
-          <w:szCs w:val="24"/>
-        </w:rPr>
-      </w:pPr>
-      <w:r>
-        <w:rPr>
-          <w:rFonts w:cs="Times New Roman"/>
-          <w:szCs w:val="24"/>
-        </w:rPr>
-        <w:t>Az AddProduct végpont rendelés-létrehozást nem végez — a kosár és a rendelés szétválasztott: a CartsController csak a kosár tartalmát kezeli, a rendelés véglegesítését az OrdersController végzi.</w:t>
-      </w:r>
-    </w:p>
-    <w:p>
-      <w:pPr>
-        <w:pStyle w:val="ListParagraph"/>
-        <w:numPr>
-          <w:ilvl w:val="0"/>
-          <w:numId w:val="19"/>
-        </w:numPr>
-        <w:rPr>
-          <w:rFonts w:cs="Times New Roman"/>
-          <w:szCs w:val="24"/>
-        </w:rPr>
-      </w:pPr>
-      <w:r>
-        <w:rPr>
-          <w:rFonts w:cs="Times New Roman"/>
-          <w:szCs w:val="24"/>
-        </w:rPr>
-        <w:t>A kosár adatai mindig valós időben tükröződnek: az AddProduct végpont minden mővelet után visszaadja a teljes, frissített kosár tartalmát, így a frontend mindig konzisztens állapotot mutat a felhasználónak.</w:t>
+        <w:t>A rendszer lekéri az aktuális időpontot (DateTime.Now).</w:t>
+      </w:r>
+    </w:p>
+    <w:p>
+      <w:pPr>
+        <w:pStyle w:val="ListParagraph"/>
+        <w:numPr>
+          <w:ilvl w:val="0"/>
+          <w:numId w:val="48"/>
+        </w:numPr>
+        <w:rPr>
+          <w:rFonts w:cs="Times New Roman"/>
+          <w:szCs w:val="24"/>
+        </w:rPr>
+      </w:pPr>
+      <w:r>
+        <w:rPr>
+          <w:rFonts w:cs="Times New Roman"/>
+          <w:szCs w:val="24"/>
+        </w:rPr>
+        <w:t>Az adatbázisból megkeresi a felhasználót az e-mail cím alapján.</w:t>
+      </w:r>
+    </w:p>
+    <w:p>
+      <w:pPr>
+        <w:pStyle w:val="ListParagraph"/>
+        <w:numPr>
+          <w:ilvl w:val="0"/>
+          <w:numId w:val="48"/>
+        </w:numPr>
+        <w:rPr>
+          <w:rFonts w:cs="Times New Roman"/>
+          <w:szCs w:val="24"/>
+        </w:rPr>
+      </w:pPr>
+      <w:r>
+        <w:rPr>
+          <w:rFonts w:cs="Times New Roman"/>
+          <w:szCs w:val="24"/>
+        </w:rPr>
+        <w:t>Betölti a felhasználóhoz tartozó jelenlegi szerepkört (Include(u =&gt; u.Role)).</w:t>
+      </w:r>
+    </w:p>
+    <w:p>
+      <w:pPr>
+        <w:pStyle w:val="ListParagraph"/>
+        <w:numPr>
+          <w:ilvl w:val="0"/>
+          <w:numId w:val="48"/>
+        </w:numPr>
+        <w:rPr>
+          <w:rFonts w:cs="Times New Roman"/>
+          <w:szCs w:val="24"/>
+        </w:rPr>
+      </w:pPr>
+      <w:r>
+        <w:rPr>
+          <w:rFonts w:cs="Times New Roman"/>
+          <w:szCs w:val="24"/>
+        </w:rPr>
+        <w:t>Lekérdezi az összes létező szerepkör azonosítóját.</w:t>
+      </w:r>
+    </w:p>
+    <w:p>
+      <w:pPr>
+        <w:pStyle w:val="ListParagraph"/>
+        <w:numPr>
+          <w:ilvl w:val="0"/>
+          <w:numId w:val="48"/>
+        </w:numPr>
+        <w:rPr>
+          <w:rFonts w:cs="Times New Roman"/>
+          <w:szCs w:val="24"/>
+        </w:rPr>
+      </w:pPr>
+      <w:r>
+        <w:rPr>
+          <w:rFonts w:cs="Times New Roman"/>
+          <w:szCs w:val="24"/>
+        </w:rPr>
+        <w:t>Ellenőrzi:</w:t>
+      </w:r>
+    </w:p>
+    <w:p>
+      <w:pPr>
+        <w:pStyle w:val="ListParagraph"/>
+        <w:numPr>
+          <w:ilvl w:val="0"/>
+          <w:numId w:val="49"/>
+        </w:numPr>
+        <w:rPr>
+          <w:rFonts w:cs="Times New Roman"/>
+          <w:szCs w:val="24"/>
+        </w:rPr>
+      </w:pPr>
+      <w:r>
+        <w:rPr>
+          <w:rFonts w:cs="Times New Roman"/>
+          <w:szCs w:val="24"/>
+        </w:rPr>
+        <w:t>létezik-e a felhasználó</w:t>
+      </w:r>
+    </w:p>
+    <w:p>
+      <w:pPr>
+        <w:pStyle w:val="ListParagraph"/>
+        <w:numPr>
+          <w:ilvl w:val="0"/>
+          <w:numId w:val="49"/>
+        </w:numPr>
+        <w:rPr>
+          <w:rFonts w:cs="Times New Roman"/>
+          <w:szCs w:val="24"/>
+        </w:rPr>
+      </w:pPr>
+      <w:r>
+        <w:rPr>
+          <w:rFonts w:cs="Times New Roman"/>
+          <w:szCs w:val="24"/>
+        </w:rPr>
+        <w:t>létezik-e a megadott szerepkör</w:t>
+      </w:r>
+    </w:p>
+    <w:p>
+      <w:pPr>
+        <w:pStyle w:val="ListParagraph"/>
+        <w:numPr>
+          <w:ilvl w:val="0"/>
+          <w:numId w:val="48"/>
+        </w:numPr>
+        <w:rPr>
+          <w:rFonts w:cs="Times New Roman"/>
+          <w:szCs w:val="24"/>
+        </w:rPr>
+      </w:pPr>
+      <w:r>
+        <w:rPr>
+          <w:rFonts w:cs="Times New Roman"/>
+          <w:szCs w:val="24"/>
+        </w:rPr>
+        <w:t>Ha minden feltétel teljesül:</w:t>
+      </w:r>
+    </w:p>
+    <w:p>
+      <w:pPr>
+        <w:pStyle w:val="ListParagraph"/>
+        <w:numPr>
+          <w:ilvl w:val="0"/>
+          <w:numId w:val="49"/>
+        </w:numPr>
+        <w:rPr>
+          <w:rFonts w:cs="Times New Roman"/>
+          <w:szCs w:val="24"/>
+        </w:rPr>
+      </w:pPr>
+      <w:r>
+        <w:rPr>
+          <w:rFonts w:cs="Times New Roman"/>
+          <w:szCs w:val="24"/>
+        </w:rPr>
+        <w:t>frissíti a felhasználó RoleId mezőjét</w:t>
+      </w:r>
+    </w:p>
+    <w:p>
+      <w:pPr>
+        <w:pStyle w:val="ListParagraph"/>
+        <w:numPr>
+          <w:ilvl w:val="0"/>
+          <w:numId w:val="49"/>
+        </w:numPr>
+        <w:rPr>
+          <w:rFonts w:cs="Times New Roman"/>
+          <w:szCs w:val="24"/>
+        </w:rPr>
+      </w:pPr>
+      <w:r>
+        <w:rPr>
+          <w:rFonts w:cs="Times New Roman"/>
+          <w:szCs w:val="24"/>
+        </w:rPr>
+        <w:t>beállítja a módosítás idejét (ModifiedAt)</w:t>
+      </w:r>
+    </w:p>
+    <w:p>
+      <w:pPr>
+        <w:pStyle w:val="ListParagraph"/>
+        <w:numPr>
+          <w:ilvl w:val="0"/>
+          <w:numId w:val="49"/>
+        </w:numPr>
+        <w:rPr>
+          <w:rFonts w:cs="Times New Roman"/>
+          <w:szCs w:val="24"/>
+        </w:rPr>
+      </w:pPr>
+      <w:r>
+        <w:rPr>
+          <w:rFonts w:cs="Times New Roman"/>
+          <w:szCs w:val="24"/>
+        </w:rPr>
+        <w:t>menti a változtatásokat az adatbázisba</w:t>
+      </w:r>
+    </w:p>
+    <w:p>
+      <w:pPr>
+        <w:rPr>
+          <w:rFonts w:cs="Times New Roman"/>
+          <w:b/>
+          <w:bCs/>
+          <w:szCs w:val="24"/>
+        </w:rPr>
+      </w:pPr>
+      <w:r>
+        <w:rPr>
+          <w:rFonts w:cs="Times New Roman"/>
+          <w:b/>
+          <w:bCs/>
+          <w:szCs w:val="24"/>
+        </w:rPr>
+        <w:t>Hibakezelés</w:t>
+      </w:r>
+    </w:p>
+    <w:p>
+      <w:pPr>
+        <w:rPr>
+          <w:rFonts w:cs="Times New Roman"/>
+          <w:szCs w:val="24"/>
+        </w:rPr>
+      </w:pPr>
+      <w:r>
+        <w:rPr>
+          <w:rFonts w:cs="Times New Roman"/>
+          <w:szCs w:val="24"/>
+        </w:rPr>
+        <w:t>A rendszer az alábbi eseteket kezeli:</w:t>
+      </w:r>
+    </w:p>
+    <w:p>
+      <w:pPr>
+        <w:pStyle w:val="ListParagraph"/>
+        <w:numPr>
+          <w:ilvl w:val="0"/>
+          <w:numId w:val="50"/>
+        </w:numPr>
+        <w:rPr>
+          <w:rFonts w:cs="Times New Roman"/>
+          <w:szCs w:val="24"/>
+        </w:rPr>
+      </w:pPr>
+      <w:r>
+        <w:rPr>
+          <w:rFonts w:cs="Times New Roman"/>
+          <w:szCs w:val="24"/>
+        </w:rPr>
+        <w:t>Felhasználó nem található</w:t>
+      </w:r>
+    </w:p>
+    <w:p>
+      <w:pPr>
+        <w:pStyle w:val="ListParagraph"/>
+        <w:numPr>
+          <w:ilvl w:val="1"/>
+          <w:numId w:val="50"/>
+        </w:numPr>
+        <w:rPr>
+          <w:rFonts w:cs="Times New Roman"/>
+          <w:szCs w:val="24"/>
+        </w:rPr>
+      </w:pPr>
+      <w:r>
+        <w:rPr>
+          <w:rFonts w:cs="Times New Roman"/>
+          <w:szCs w:val="24"/>
+        </w:rPr>
+        <w:t>Válasz: 404 Not Found</w:t>
+      </w:r>
+    </w:p>
+    <w:p>
+      <w:pPr>
+        <w:pStyle w:val="ListParagraph"/>
+        <w:numPr>
+          <w:ilvl w:val="1"/>
+          <w:numId w:val="50"/>
+        </w:numPr>
+        <w:rPr>
+          <w:rFonts w:cs="Times New Roman"/>
+          <w:szCs w:val="24"/>
+        </w:rPr>
+      </w:pPr>
+      <w:r>
+        <w:rPr>
+          <w:rFonts w:cs="Times New Roman"/>
+          <w:szCs w:val="24"/>
+        </w:rPr>
+        <w:t>Üzenet: "User not found."</w:t>
+      </w:r>
+    </w:p>
+    <w:p>
+      <w:pPr>
+        <w:pStyle w:val="ListParagraph"/>
+        <w:numPr>
+          <w:ilvl w:val="0"/>
+          <w:numId w:val="50"/>
+        </w:numPr>
+        <w:rPr>
+          <w:rFonts w:cs="Times New Roman"/>
+          <w:szCs w:val="24"/>
+        </w:rPr>
+      </w:pPr>
+      <w:r>
+        <w:rPr>
+          <w:rFonts w:cs="Times New Roman"/>
+          <w:szCs w:val="24"/>
+        </w:rPr>
+        <w:t>Nem létező szerepkör</w:t>
+      </w:r>
+    </w:p>
+    <w:p>
+      <w:pPr>
+        <w:pStyle w:val="ListParagraph"/>
+        <w:numPr>
+          <w:ilvl w:val="1"/>
+          <w:numId w:val="50"/>
+        </w:numPr>
+        <w:rPr>
+          <w:rFonts w:cs="Times New Roman"/>
+          <w:szCs w:val="24"/>
+        </w:rPr>
+      </w:pPr>
+      <w:r>
+        <w:rPr>
+          <w:rFonts w:cs="Times New Roman"/>
+          <w:szCs w:val="24"/>
+        </w:rPr>
+        <w:t>Válasz: 404 Not Found</w:t>
+      </w:r>
+    </w:p>
+    <w:p>
+      <w:pPr>
+        <w:pStyle w:val="ListParagraph"/>
+        <w:numPr>
+          <w:ilvl w:val="1"/>
+          <w:numId w:val="50"/>
+        </w:numPr>
+        <w:rPr>
+          <w:rFonts w:cs="Times New Roman"/>
+          <w:szCs w:val="24"/>
+        </w:rPr>
+      </w:pPr>
+      <w:r>
+        <w:rPr>
+          <w:rFonts w:cs="Times New Roman"/>
+          <w:szCs w:val="24"/>
+        </w:rPr>
+        <w:t>Üzenet: "Role not found."</w:t>
+      </w:r>
+    </w:p>
+    <w:p>
+      <w:pPr>
+        <w:pStyle w:val="ListParagraph"/>
+        <w:numPr>
+          <w:ilvl w:val="0"/>
+          <w:numId w:val="50"/>
+        </w:numPr>
+        <w:rPr>
+          <w:rFonts w:cs="Times New Roman"/>
+          <w:szCs w:val="24"/>
+        </w:rPr>
+      </w:pPr>
+      <w:r>
+        <w:rPr>
+          <w:rFonts w:cs="Times New Roman"/>
+          <w:szCs w:val="24"/>
+        </w:rPr>
+        <w:t>Sikeres válasz</w:t>
+      </w:r>
+    </w:p>
+    <w:p>
+      <w:pPr>
+        <w:pStyle w:val="ListParagraph"/>
+        <w:numPr>
+          <w:ilvl w:val="1"/>
+          <w:numId w:val="50"/>
+        </w:numPr>
+        <w:rPr>
+          <w:rFonts w:cs="Times New Roman"/>
+          <w:szCs w:val="24"/>
+        </w:rPr>
+      </w:pPr>
+      <w:r>
+        <w:rPr>
+          <w:rFonts w:cs="Times New Roman"/>
+          <w:szCs w:val="24"/>
+        </w:rPr>
+        <w:t>Sikeres módosítás esetén:</w:t>
+      </w:r>
+    </w:p>
+    <w:p>
+      <w:pPr>
+        <w:pStyle w:val="ListParagraph"/>
+        <w:numPr>
+          <w:ilvl w:val="1"/>
+          <w:numId w:val="50"/>
+        </w:numPr>
+        <w:rPr>
+          <w:rFonts w:cs="Times New Roman"/>
+          <w:szCs w:val="24"/>
+        </w:rPr>
+      </w:pPr>
+      <w:r>
+        <w:rPr>
+          <w:rFonts w:cs="Times New Roman"/>
+          <w:szCs w:val="24"/>
+        </w:rPr>
+        <w:t>HTTP státuszkód: 204 NoContent</w:t>
+      </w:r>
+    </w:p>
+    <w:p>
+      <w:pPr>
+        <w:pStyle w:val="ListParagraph"/>
+        <w:numPr>
+          <w:ilvl w:val="1"/>
+          <w:numId w:val="50"/>
+        </w:numPr>
+        <w:rPr>
+          <w:rFonts w:cs="Times New Roman"/>
+          <w:szCs w:val="24"/>
+        </w:rPr>
+      </w:pPr>
+      <w:r>
+        <w:rPr>
+          <w:rFonts w:cs="Times New Roman"/>
+          <w:szCs w:val="24"/>
+        </w:rPr>
+        <w:t>A válasz nem tartalmaz adatot, csak a sikeres végrehajtást jelzi.</w:t>
       </w:r>
     </w:p>
     <w:p>
@@ -4702,6 +5268,208 @@
         </w:numPr>
       </w:pPr>
       <w:r>
+        <w:t>Kosár és rendeléskezelési folyamat</w:t>
+      </w:r>
+    </w:p>
+    <w:p>
+      <w:pPr>
+        <w:rPr>
+          <w:rFonts w:cs="Times New Roman"/>
+          <w:szCs w:val="24"/>
+        </w:rPr>
+      </w:pPr>
+      <w:r>
+        <w:rPr>
+          <w:rFonts w:cs="Times New Roman"/>
+          <w:szCs w:val="24"/>
+        </w:rPr>
+        <w:t>A CartsController kezeli a kosárral kapcsolatos műveleteket. A POST /carts/AddProduct végpont egyszerre látja el a hozzáadás, mennyiségmódosítás és eltávolítás funkcióját. Minden végpont JWT tokenből olvassa ki a bejelentkezett felhasználó azonosítóját (User.Claims, "userId" claim), égy a kosár mindig az aktuális felhasználóhoz kötődik.</w:t>
+      </w:r>
+    </w:p>
+    <w:p>
+      <w:pPr>
+        <w:rPr>
+          <w:rFonts w:cs="Times New Roman"/>
+          <w:b/>
+          <w:szCs w:val="24"/>
+        </w:rPr>
+      </w:pPr>
+      <w:r>
+        <w:rPr>
+          <w:rFonts w:cs="Times New Roman"/>
+          <w:b/>
+          <w:szCs w:val="24"/>
+        </w:rPr>
+        <w:t>Termék hozzáadása a kosárhoz:</w:t>
+      </w:r>
+    </w:p>
+    <w:p>
+      <w:pPr>
+        <w:pStyle w:val="ListParagraph"/>
+        <w:numPr>
+          <w:ilvl w:val="0"/>
+          <w:numId w:val="20"/>
+        </w:numPr>
+        <w:rPr>
+          <w:rFonts w:cs="Times New Roman"/>
+          <w:szCs w:val="24"/>
+        </w:rPr>
+      </w:pPr>
+      <w:r>
+        <w:rPr>
+          <w:rFonts w:cs="Times New Roman"/>
+          <w:szCs w:val="24"/>
+        </w:rPr>
+        <w:lastRenderedPageBreak/>
+        <w:t>A frontend POST kérést küld a /carts/AddProduct végpontra egy AddProductToCartDto objektummal (ProductId, Quantity). A backend betölti a bejelentkezett felhasználó kosárát eager loading-gal: CartProducts → Product → ProductSpecs → Spec és Category.</w:t>
+      </w:r>
+    </w:p>
+    <w:p>
+      <w:pPr>
+        <w:pStyle w:val="ListParagraph"/>
+        <w:numPr>
+          <w:ilvl w:val="0"/>
+          <w:numId w:val="20"/>
+        </w:numPr>
+        <w:rPr>
+          <w:rFonts w:cs="Times New Roman"/>
+          <w:szCs w:val="24"/>
+        </w:rPr>
+      </w:pPr>
+      <w:r>
+        <w:rPr>
+          <w:rFonts w:cs="Times New Roman"/>
+          <w:szCs w:val="24"/>
+        </w:rPr>
+        <w:t>A rendszer lekérdezi a kosárban lévő termék-azonosítókat (existingProductIds). Ha a termék már szerepel: Quantity &lt;= 0 esetén törli a CartProduct sort (eltávolítás), egyébként frissíti a mennyiséget. Ha a termék még nincs a kosárban: Quantity &lt;= 0 esetén 404-et ad vissza, egyébként új CartProduct sort szúr be az adatbázisba.</w:t>
+      </w:r>
+    </w:p>
+    <w:p>
+      <w:pPr>
+        <w:pStyle w:val="ListParagraph"/>
+        <w:numPr>
+          <w:ilvl w:val="0"/>
+          <w:numId w:val="20"/>
+        </w:numPr>
+        <w:rPr>
+          <w:rFonts w:cs="Times New Roman"/>
+          <w:szCs w:val="24"/>
+        </w:rPr>
+      </w:pPr>
+      <w:r>
+        <w:rPr>
+          <w:rFonts w:cs="Times New Roman"/>
+          <w:szCs w:val="24"/>
+        </w:rPr>
+        <w:t>Mindkét esetben a végpont 201 CreatedAtAction választ ad vissza, és a MapToDto() metódus a kosár tartalmát CartReadDto-vá alakítja: tartalmazza a kosárazonosítót, a felhasználó e-mail címét, és minden termékhez a mennyiséget, az árat, a speci-fikációkat és a kategória adatait.</w:t>
+      </w:r>
+    </w:p>
+    <w:p>
+      <w:pPr>
+        <w:rPr>
+          <w:rFonts w:cs="Times New Roman"/>
+          <w:b/>
+          <w:szCs w:val="24"/>
+        </w:rPr>
+      </w:pPr>
+      <w:r>
+        <w:rPr>
+          <w:rFonts w:cs="Times New Roman"/>
+          <w:b/>
+          <w:szCs w:val="24"/>
+        </w:rPr>
+        <w:t>Kosár lekérdezése:</w:t>
+      </w:r>
+    </w:p>
+    <w:p>
+      <w:pPr>
+        <w:pStyle w:val="ListParagraph"/>
+        <w:numPr>
+          <w:ilvl w:val="0"/>
+          <w:numId w:val="19"/>
+        </w:numPr>
+        <w:rPr>
+          <w:rFonts w:cs="Times New Roman"/>
+          <w:szCs w:val="24"/>
+        </w:rPr>
+      </w:pPr>
+      <w:r>
+        <w:rPr>
+          <w:rFonts w:cs="Times New Roman"/>
+          <w:szCs w:val="24"/>
+        </w:rPr>
+        <w:t>A GET /carts/Current végpont ([Authorize]) a JWT tokenből kiolvasott userId alapján kérdezi le a bejelentkezett felhasználó kosárát. A GET /carts/{id} végpont kosazöonsító alapján érheti el bárki a kosár adatait (például a rendelés megerősítése után), 404-et ad vissza, ha a kosár nem található.</w:t>
+      </w:r>
+    </w:p>
+    <w:p>
+      <w:pPr>
+        <w:pStyle w:val="ListParagraph"/>
+        <w:numPr>
+          <w:ilvl w:val="0"/>
+          <w:numId w:val="19"/>
+        </w:numPr>
+        <w:rPr>
+          <w:rFonts w:cs="Times New Roman"/>
+          <w:szCs w:val="24"/>
+        </w:rPr>
+      </w:pPr>
+      <w:r>
+        <w:rPr>
+          <w:rFonts w:cs="Times New Roman"/>
+          <w:szCs w:val="24"/>
+        </w:rPr>
+        <w:t>A GET /carts végpont az összes kosár adatait adja vissza (adminisztrációs célra). Mindkét lekérdező végpont ugyanazt a többszintű eager loading-ot alkalmazza: CartProducts → Product → ProductSpecs → Spec, és az eredményt CartReadDto-ként adja vissza.</w:t>
+      </w:r>
+    </w:p>
+    <w:p>
+      <w:pPr>
+        <w:pStyle w:val="ListParagraph"/>
+        <w:numPr>
+          <w:ilvl w:val="0"/>
+          <w:numId w:val="19"/>
+        </w:numPr>
+        <w:rPr>
+          <w:rFonts w:cs="Times New Roman"/>
+          <w:szCs w:val="24"/>
+        </w:rPr>
+      </w:pPr>
+      <w:r>
+        <w:rPr>
+          <w:rFonts w:cs="Times New Roman"/>
+          <w:szCs w:val="24"/>
+        </w:rPr>
+        <w:t>Az AddProduct végpont rendelés-létrehozást nem végez — a kosár és a rendelés szétválasztott: a CartsController csak a kosár tartalmát kezeli, a rendelés véglegesítését az OrdersController végzi.</w:t>
+      </w:r>
+    </w:p>
+    <w:p>
+      <w:pPr>
+        <w:pStyle w:val="ListParagraph"/>
+        <w:numPr>
+          <w:ilvl w:val="0"/>
+          <w:numId w:val="19"/>
+        </w:numPr>
+        <w:rPr>
+          <w:rFonts w:cs="Times New Roman"/>
+          <w:szCs w:val="24"/>
+        </w:rPr>
+      </w:pPr>
+      <w:r>
+        <w:rPr>
+          <w:rFonts w:cs="Times New Roman"/>
+          <w:szCs w:val="24"/>
+        </w:rPr>
+        <w:t>A kosár adatai mindig valós időben tükröződnek: az AddProduct végpont minden mővelet után visszaadja a teljes, frissített kosár tartalmát, így a frontend mindig konzisztens állapotot mutat a felhasználónak.</w:t>
+      </w:r>
+    </w:p>
+    <w:p>
+      <w:pPr>
+        <w:pStyle w:val="Heading1"/>
+        <w:numPr>
+          <w:ilvl w:val="1"/>
+          <w:numId w:val="4"/>
+        </w:numPr>
+      </w:pPr>
+      <w:r>
         <w:t>Rendelés létrehozása és életciklus-kezelés</w:t>
       </w:r>
     </w:p>
@@ -4734,6 +5502,7 @@
           <w:b/>
           <w:szCs w:val="24"/>
         </w:rPr>
+        <w:lastRenderedPageBreak/>
         <w:t>Rendelés létrehozásának lépései:</w:t>
       </w:r>
     </w:p>
@@ -4831,7 +5600,6 @@
           <w:rFonts w:cs="Times New Roman"/>
           <w:szCs w:val="24"/>
         </w:rPr>
-        <w:lastRenderedPageBreak/>
         <w:t>Rendelés lekérdezése és válasz:</w:t>
       </w:r>
     </w:p>
@@ -4954,10 +5722,7 @@
         </w:numPr>
       </w:pPr>
       <w:r>
-        <w:t>T</w:t>
-      </w:r>
-      <w:r>
-        <w:t>esztelési stratégia</w:t>
+        <w:t>Tesztelési stratégia</w:t>
       </w:r>
     </w:p>
     <w:p>
@@ -6600,6 +7365,232 @@
     </w:lvl>
   </w:abstractNum>
   <w:abstractNum w:abstractNumId="7" w15:restartNumberingAfterBreak="0">
+    <w:nsid w:val="2314643E"/>
+    <w:multiLevelType w:val="hybridMultilevel"/>
+    <w:tmpl w:val="9BF0B650"/>
+    <w:lvl w:ilvl="0" w:tplc="08090001">
+      <w:start w:val="1"/>
+      <w:numFmt w:val="bullet"/>
+      <w:lvlText w:val=""/>
+      <w:lvlJc w:val="left"/>
+      <w:pPr>
+        <w:ind w:left="720" w:hanging="360"/>
+      </w:pPr>
+      <w:rPr>
+        <w:rFonts w:ascii="Symbol" w:hAnsi="Symbol" w:hint="default"/>
+      </w:rPr>
+    </w:lvl>
+    <w:lvl w:ilvl="1" w:tplc="08090003">
+      <w:start w:val="1"/>
+      <w:numFmt w:val="bullet"/>
+      <w:lvlText w:val="o"/>
+      <w:lvlJc w:val="left"/>
+      <w:pPr>
+        <w:ind w:left="1440" w:hanging="360"/>
+      </w:pPr>
+      <w:rPr>
+        <w:rFonts w:ascii="Courier New" w:hAnsi="Courier New" w:cs="Courier New" w:hint="default"/>
+      </w:rPr>
+    </w:lvl>
+    <w:lvl w:ilvl="2" w:tplc="08090005" w:tentative="1">
+      <w:start w:val="1"/>
+      <w:numFmt w:val="bullet"/>
+      <w:lvlText w:val=""/>
+      <w:lvlJc w:val="left"/>
+      <w:pPr>
+        <w:ind w:left="2160" w:hanging="360"/>
+      </w:pPr>
+      <w:rPr>
+        <w:rFonts w:ascii="Wingdings" w:hAnsi="Wingdings" w:hint="default"/>
+      </w:rPr>
+    </w:lvl>
+    <w:lvl w:ilvl="3" w:tplc="08090001" w:tentative="1">
+      <w:start w:val="1"/>
+      <w:numFmt w:val="bullet"/>
+      <w:lvlText w:val=""/>
+      <w:lvlJc w:val="left"/>
+      <w:pPr>
+        <w:ind w:left="2880" w:hanging="360"/>
+      </w:pPr>
+      <w:rPr>
+        <w:rFonts w:ascii="Symbol" w:hAnsi="Symbol" w:hint="default"/>
+      </w:rPr>
+    </w:lvl>
+    <w:lvl w:ilvl="4" w:tplc="08090003" w:tentative="1">
+      <w:start w:val="1"/>
+      <w:numFmt w:val="bullet"/>
+      <w:lvlText w:val="o"/>
+      <w:lvlJc w:val="left"/>
+      <w:pPr>
+        <w:ind w:left="3600" w:hanging="360"/>
+      </w:pPr>
+      <w:rPr>
+        <w:rFonts w:ascii="Courier New" w:hAnsi="Courier New" w:cs="Courier New" w:hint="default"/>
+      </w:rPr>
+    </w:lvl>
+    <w:lvl w:ilvl="5" w:tplc="08090005" w:tentative="1">
+      <w:start w:val="1"/>
+      <w:numFmt w:val="bullet"/>
+      <w:lvlText w:val=""/>
+      <w:lvlJc w:val="left"/>
+      <w:pPr>
+        <w:ind w:left="4320" w:hanging="360"/>
+      </w:pPr>
+      <w:rPr>
+        <w:rFonts w:ascii="Wingdings" w:hAnsi="Wingdings" w:hint="default"/>
+      </w:rPr>
+    </w:lvl>
+    <w:lvl w:ilvl="6" w:tplc="08090001" w:tentative="1">
+      <w:start w:val="1"/>
+      <w:numFmt w:val="bullet"/>
+      <w:lvlText w:val=""/>
+      <w:lvlJc w:val="left"/>
+      <w:pPr>
+        <w:ind w:left="5040" w:hanging="360"/>
+      </w:pPr>
+      <w:rPr>
+        <w:rFonts w:ascii="Symbol" w:hAnsi="Symbol" w:hint="default"/>
+      </w:rPr>
+    </w:lvl>
+    <w:lvl w:ilvl="7" w:tplc="08090003" w:tentative="1">
+      <w:start w:val="1"/>
+      <w:numFmt w:val="bullet"/>
+      <w:lvlText w:val="o"/>
+      <w:lvlJc w:val="left"/>
+      <w:pPr>
+        <w:ind w:left="5760" w:hanging="360"/>
+      </w:pPr>
+      <w:rPr>
+        <w:rFonts w:ascii="Courier New" w:hAnsi="Courier New" w:cs="Courier New" w:hint="default"/>
+      </w:rPr>
+    </w:lvl>
+    <w:lvl w:ilvl="8" w:tplc="08090005" w:tentative="1">
+      <w:start w:val="1"/>
+      <w:numFmt w:val="bullet"/>
+      <w:lvlText w:val=""/>
+      <w:lvlJc w:val="left"/>
+      <w:pPr>
+        <w:ind w:left="6480" w:hanging="360"/>
+      </w:pPr>
+      <w:rPr>
+        <w:rFonts w:ascii="Wingdings" w:hAnsi="Wingdings" w:hint="default"/>
+      </w:rPr>
+    </w:lvl>
+  </w:abstractNum>
+  <w:abstractNum w:abstractNumId="8" w15:restartNumberingAfterBreak="0">
+    <w:nsid w:val="23867C95"/>
+    <w:multiLevelType w:val="hybridMultilevel"/>
+    <w:tmpl w:val="4FBE7F9A"/>
+    <w:lvl w:ilvl="0" w:tplc="08090001">
+      <w:start w:val="1"/>
+      <w:numFmt w:val="bullet"/>
+      <w:lvlText w:val=""/>
+      <w:lvlJc w:val="left"/>
+      <w:pPr>
+        <w:ind w:left="720" w:hanging="360"/>
+      </w:pPr>
+      <w:rPr>
+        <w:rFonts w:ascii="Symbol" w:hAnsi="Symbol" w:hint="default"/>
+      </w:rPr>
+    </w:lvl>
+    <w:lvl w:ilvl="1" w:tplc="08090003" w:tentative="1">
+      <w:start w:val="1"/>
+      <w:numFmt w:val="bullet"/>
+      <w:lvlText w:val="o"/>
+      <w:lvlJc w:val="left"/>
+      <w:pPr>
+        <w:ind w:left="1440" w:hanging="360"/>
+      </w:pPr>
+      <w:rPr>
+        <w:rFonts w:ascii="Courier New" w:hAnsi="Courier New" w:cs="Courier New" w:hint="default"/>
+      </w:rPr>
+    </w:lvl>
+    <w:lvl w:ilvl="2" w:tplc="08090005" w:tentative="1">
+      <w:start w:val="1"/>
+      <w:numFmt w:val="bullet"/>
+      <w:lvlText w:val=""/>
+      <w:lvlJc w:val="left"/>
+      <w:pPr>
+        <w:ind w:left="2160" w:hanging="360"/>
+      </w:pPr>
+      <w:rPr>
+        <w:rFonts w:ascii="Wingdings" w:hAnsi="Wingdings" w:hint="default"/>
+      </w:rPr>
+    </w:lvl>
+    <w:lvl w:ilvl="3" w:tplc="08090001" w:tentative="1">
+      <w:start w:val="1"/>
+      <w:numFmt w:val="bullet"/>
+      <w:lvlText w:val=""/>
+      <w:lvlJc w:val="left"/>
+      <w:pPr>
+        <w:ind w:left="2880" w:hanging="360"/>
+      </w:pPr>
+      <w:rPr>
+        <w:rFonts w:ascii="Symbol" w:hAnsi="Symbol" w:hint="default"/>
+      </w:rPr>
+    </w:lvl>
+    <w:lvl w:ilvl="4" w:tplc="08090003" w:tentative="1">
+      <w:start w:val="1"/>
+      <w:numFmt w:val="bullet"/>
+      <w:lvlText w:val="o"/>
+      <w:lvlJc w:val="left"/>
+      <w:pPr>
+        <w:ind w:left="3600" w:hanging="360"/>
+      </w:pPr>
+      <w:rPr>
+        <w:rFonts w:ascii="Courier New" w:hAnsi="Courier New" w:cs="Courier New" w:hint="default"/>
+      </w:rPr>
+    </w:lvl>
+    <w:lvl w:ilvl="5" w:tplc="08090005" w:tentative="1">
+      <w:start w:val="1"/>
+      <w:numFmt w:val="bullet"/>
+      <w:lvlText w:val=""/>
+      <w:lvlJc w:val="left"/>
+      <w:pPr>
+        <w:ind w:left="4320" w:hanging="360"/>
+      </w:pPr>
+      <w:rPr>
+        <w:rFonts w:ascii="Wingdings" w:hAnsi="Wingdings" w:hint="default"/>
+      </w:rPr>
+    </w:lvl>
+    <w:lvl w:ilvl="6" w:tplc="08090001" w:tentative="1">
+      <w:start w:val="1"/>
+      <w:numFmt w:val="bullet"/>
+      <w:lvlText w:val=""/>
+      <w:lvlJc w:val="left"/>
+      <w:pPr>
+        <w:ind w:left="5040" w:hanging="360"/>
+      </w:pPr>
+      <w:rPr>
+        <w:rFonts w:ascii="Symbol" w:hAnsi="Symbol" w:hint="default"/>
+      </w:rPr>
+    </w:lvl>
+    <w:lvl w:ilvl="7" w:tplc="08090003" w:tentative="1">
+      <w:start w:val="1"/>
+      <w:numFmt w:val="bullet"/>
+      <w:lvlText w:val="o"/>
+      <w:lvlJc w:val="left"/>
+      <w:pPr>
+        <w:ind w:left="5760" w:hanging="360"/>
+      </w:pPr>
+      <w:rPr>
+        <w:rFonts w:ascii="Courier New" w:hAnsi="Courier New" w:cs="Courier New" w:hint="default"/>
+      </w:rPr>
+    </w:lvl>
+    <w:lvl w:ilvl="8" w:tplc="08090005" w:tentative="1">
+      <w:start w:val="1"/>
+      <w:numFmt w:val="bullet"/>
+      <w:lvlText w:val=""/>
+      <w:lvlJc w:val="left"/>
+      <w:pPr>
+        <w:ind w:left="6480" w:hanging="360"/>
+      </w:pPr>
+      <w:rPr>
+        <w:rFonts w:ascii="Wingdings" w:hAnsi="Wingdings" w:hint="default"/>
+      </w:rPr>
+    </w:lvl>
+  </w:abstractNum>
+  <w:abstractNum w:abstractNumId="9" w15:restartNumberingAfterBreak="0">
     <w:nsid w:val="274E02EA"/>
     <w:multiLevelType w:val="multilevel"/>
     <w:tmpl w:val="ADC4D118"/>
@@ -6712,7 +7703,7 @@
       </w:rPr>
     </w:lvl>
   </w:abstractNum>
-  <w:abstractNum w:abstractNumId="8" w15:restartNumberingAfterBreak="0">
+  <w:abstractNum w:abstractNumId="10" w15:restartNumberingAfterBreak="0">
     <w:nsid w:val="2CC71388"/>
     <w:multiLevelType w:val="multilevel"/>
     <w:tmpl w:val="8C482A5A"/>
@@ -6879,10 +7870,10 @@
       </w:rPr>
     </w:lvl>
   </w:abstractNum>
-  <w:abstractNum w:abstractNumId="9" w15:restartNumberingAfterBreak="0">
+  <w:abstractNum w:abstractNumId="11" w15:restartNumberingAfterBreak="0">
     <w:nsid w:val="32C60FEC"/>
     <w:multiLevelType w:val="hybridMultilevel"/>
-    <w:tmpl w:val="C810B99A"/>
+    <w:tmpl w:val="AF0AC862"/>
     <w:lvl w:ilvl="0" w:tplc="08090001">
       <w:start w:val="1"/>
       <w:numFmt w:val="bullet"/>
@@ -6992,7 +7983,7 @@
       </w:rPr>
     </w:lvl>
   </w:abstractNum>
-  <w:abstractNum w:abstractNumId="10" w15:restartNumberingAfterBreak="0">
+  <w:abstractNum w:abstractNumId="12" w15:restartNumberingAfterBreak="0">
     <w:nsid w:val="39B33AD3"/>
     <w:multiLevelType w:val="hybridMultilevel"/>
     <w:tmpl w:val="D09EF02E"/>
@@ -7105,7 +8096,120 @@
       </w:rPr>
     </w:lvl>
   </w:abstractNum>
-  <w:abstractNum w:abstractNumId="11" w15:restartNumberingAfterBreak="0">
+  <w:abstractNum w:abstractNumId="13" w15:restartNumberingAfterBreak="0">
+    <w:nsid w:val="3BF736F6"/>
+    <w:multiLevelType w:val="hybridMultilevel"/>
+    <w:tmpl w:val="97AC38C6"/>
+    <w:lvl w:ilvl="0" w:tplc="08090001">
+      <w:start w:val="1"/>
+      <w:numFmt w:val="bullet"/>
+      <w:lvlText w:val=""/>
+      <w:lvlJc w:val="left"/>
+      <w:pPr>
+        <w:ind w:left="1069" w:hanging="360"/>
+      </w:pPr>
+      <w:rPr>
+        <w:rFonts w:ascii="Symbol" w:hAnsi="Symbol" w:hint="default"/>
+      </w:rPr>
+    </w:lvl>
+    <w:lvl w:ilvl="1" w:tplc="08090003" w:tentative="1">
+      <w:start w:val="1"/>
+      <w:numFmt w:val="bullet"/>
+      <w:lvlText w:val="o"/>
+      <w:lvlJc w:val="left"/>
+      <w:pPr>
+        <w:ind w:left="1789" w:hanging="360"/>
+      </w:pPr>
+      <w:rPr>
+        <w:rFonts w:ascii="Courier New" w:hAnsi="Courier New" w:cs="Courier New" w:hint="default"/>
+      </w:rPr>
+    </w:lvl>
+    <w:lvl w:ilvl="2" w:tplc="08090005" w:tentative="1">
+      <w:start w:val="1"/>
+      <w:numFmt w:val="bullet"/>
+      <w:lvlText w:val=""/>
+      <w:lvlJc w:val="left"/>
+      <w:pPr>
+        <w:ind w:left="2509" w:hanging="360"/>
+      </w:pPr>
+      <w:rPr>
+        <w:rFonts w:ascii="Wingdings" w:hAnsi="Wingdings" w:hint="default"/>
+      </w:rPr>
+    </w:lvl>
+    <w:lvl w:ilvl="3" w:tplc="08090001" w:tentative="1">
+      <w:start w:val="1"/>
+      <w:numFmt w:val="bullet"/>
+      <w:lvlText w:val=""/>
+      <w:lvlJc w:val="left"/>
+      <w:pPr>
+        <w:ind w:left="3229" w:hanging="360"/>
+      </w:pPr>
+      <w:rPr>
+        <w:rFonts w:ascii="Symbol" w:hAnsi="Symbol" w:hint="default"/>
+      </w:rPr>
+    </w:lvl>
+    <w:lvl w:ilvl="4" w:tplc="08090003" w:tentative="1">
+      <w:start w:val="1"/>
+      <w:numFmt w:val="bullet"/>
+      <w:lvlText w:val="o"/>
+      <w:lvlJc w:val="left"/>
+      <w:pPr>
+        <w:ind w:left="3949" w:hanging="360"/>
+      </w:pPr>
+      <w:rPr>
+        <w:rFonts w:ascii="Courier New" w:hAnsi="Courier New" w:cs="Courier New" w:hint="default"/>
+      </w:rPr>
+    </w:lvl>
+    <w:lvl w:ilvl="5" w:tplc="08090005" w:tentative="1">
+      <w:start w:val="1"/>
+      <w:numFmt w:val="bullet"/>
+      <w:lvlText w:val=""/>
+      <w:lvlJc w:val="left"/>
+      <w:pPr>
+        <w:ind w:left="4669" w:hanging="360"/>
+      </w:pPr>
+      <w:rPr>
+        <w:rFonts w:ascii="Wingdings" w:hAnsi="Wingdings" w:hint="default"/>
+      </w:rPr>
+    </w:lvl>
+    <w:lvl w:ilvl="6" w:tplc="08090001" w:tentative="1">
+      <w:start w:val="1"/>
+      <w:numFmt w:val="bullet"/>
+      <w:lvlText w:val=""/>
+      <w:lvlJc w:val="left"/>
+      <w:pPr>
+        <w:ind w:left="5389" w:hanging="360"/>
+      </w:pPr>
+      <w:rPr>
+        <w:rFonts w:ascii="Symbol" w:hAnsi="Symbol" w:hint="default"/>
+      </w:rPr>
+    </w:lvl>
+    <w:lvl w:ilvl="7" w:tplc="08090003" w:tentative="1">
+      <w:start w:val="1"/>
+      <w:numFmt w:val="bullet"/>
+      <w:lvlText w:val="o"/>
+      <w:lvlJc w:val="left"/>
+      <w:pPr>
+        <w:ind w:left="6109" w:hanging="360"/>
+      </w:pPr>
+      <w:rPr>
+        <w:rFonts w:ascii="Courier New" w:hAnsi="Courier New" w:cs="Courier New" w:hint="default"/>
+      </w:rPr>
+    </w:lvl>
+    <w:lvl w:ilvl="8" w:tplc="08090005" w:tentative="1">
+      <w:start w:val="1"/>
+      <w:numFmt w:val="bullet"/>
+      <w:lvlText w:val=""/>
+      <w:lvlJc w:val="left"/>
+      <w:pPr>
+        <w:ind w:left="6829" w:hanging="360"/>
+      </w:pPr>
+      <w:rPr>
+        <w:rFonts w:ascii="Wingdings" w:hAnsi="Wingdings" w:hint="default"/>
+      </w:rPr>
+    </w:lvl>
+  </w:abstractNum>
+  <w:abstractNum w:abstractNumId="14" w15:restartNumberingAfterBreak="0">
     <w:nsid w:val="3E0B5DDA"/>
     <w:multiLevelType w:val="multilevel"/>
     <w:tmpl w:val="34CAAE0C"/>
@@ -7218,7 +8322,120 @@
       </w:rPr>
     </w:lvl>
   </w:abstractNum>
-  <w:abstractNum w:abstractNumId="12" w15:restartNumberingAfterBreak="0">
+  <w:abstractNum w:abstractNumId="15" w15:restartNumberingAfterBreak="0">
+    <w:nsid w:val="4DC548BC"/>
+    <w:multiLevelType w:val="hybridMultilevel"/>
+    <w:tmpl w:val="1FC29A70"/>
+    <w:lvl w:ilvl="0" w:tplc="08090001">
+      <w:start w:val="1"/>
+      <w:numFmt w:val="bullet"/>
+      <w:lvlText w:val=""/>
+      <w:lvlJc w:val="left"/>
+      <w:pPr>
+        <w:ind w:left="720" w:hanging="360"/>
+      </w:pPr>
+      <w:rPr>
+        <w:rFonts w:ascii="Symbol" w:hAnsi="Symbol" w:hint="default"/>
+      </w:rPr>
+    </w:lvl>
+    <w:lvl w:ilvl="1" w:tplc="08090003" w:tentative="1">
+      <w:start w:val="1"/>
+      <w:numFmt w:val="bullet"/>
+      <w:lvlText w:val="o"/>
+      <w:lvlJc w:val="left"/>
+      <w:pPr>
+        <w:ind w:left="1440" w:hanging="360"/>
+      </w:pPr>
+      <w:rPr>
+        <w:rFonts w:ascii="Courier New" w:hAnsi="Courier New" w:cs="Courier New" w:hint="default"/>
+      </w:rPr>
+    </w:lvl>
+    <w:lvl w:ilvl="2" w:tplc="08090005" w:tentative="1">
+      <w:start w:val="1"/>
+      <w:numFmt w:val="bullet"/>
+      <w:lvlText w:val=""/>
+      <w:lvlJc w:val="left"/>
+      <w:pPr>
+        <w:ind w:left="2160" w:hanging="360"/>
+      </w:pPr>
+      <w:rPr>
+        <w:rFonts w:ascii="Wingdings" w:hAnsi="Wingdings" w:hint="default"/>
+      </w:rPr>
+    </w:lvl>
+    <w:lvl w:ilvl="3" w:tplc="08090001" w:tentative="1">
+      <w:start w:val="1"/>
+      <w:numFmt w:val="bullet"/>
+      <w:lvlText w:val=""/>
+      <w:lvlJc w:val="left"/>
+      <w:pPr>
+        <w:ind w:left="2880" w:hanging="360"/>
+      </w:pPr>
+      <w:rPr>
+        <w:rFonts w:ascii="Symbol" w:hAnsi="Symbol" w:hint="default"/>
+      </w:rPr>
+    </w:lvl>
+    <w:lvl w:ilvl="4" w:tplc="08090003" w:tentative="1">
+      <w:start w:val="1"/>
+      <w:numFmt w:val="bullet"/>
+      <w:lvlText w:val="o"/>
+      <w:lvlJc w:val="left"/>
+      <w:pPr>
+        <w:ind w:left="3600" w:hanging="360"/>
+      </w:pPr>
+      <w:rPr>
+        <w:rFonts w:ascii="Courier New" w:hAnsi="Courier New" w:cs="Courier New" w:hint="default"/>
+      </w:rPr>
+    </w:lvl>
+    <w:lvl w:ilvl="5" w:tplc="08090005" w:tentative="1">
+      <w:start w:val="1"/>
+      <w:numFmt w:val="bullet"/>
+      <w:lvlText w:val=""/>
+      <w:lvlJc w:val="left"/>
+      <w:pPr>
+        <w:ind w:left="4320" w:hanging="360"/>
+      </w:pPr>
+      <w:rPr>
+        <w:rFonts w:ascii="Wingdings" w:hAnsi="Wingdings" w:hint="default"/>
+      </w:rPr>
+    </w:lvl>
+    <w:lvl w:ilvl="6" w:tplc="08090001" w:tentative="1">
+      <w:start w:val="1"/>
+      <w:numFmt w:val="bullet"/>
+      <w:lvlText w:val=""/>
+      <w:lvlJc w:val="left"/>
+      <w:pPr>
+        <w:ind w:left="5040" w:hanging="360"/>
+      </w:pPr>
+      <w:rPr>
+        <w:rFonts w:ascii="Symbol" w:hAnsi="Symbol" w:hint="default"/>
+      </w:rPr>
+    </w:lvl>
+    <w:lvl w:ilvl="7" w:tplc="08090003" w:tentative="1">
+      <w:start w:val="1"/>
+      <w:numFmt w:val="bullet"/>
+      <w:lvlText w:val="o"/>
+      <w:lvlJc w:val="left"/>
+      <w:pPr>
+        <w:ind w:left="5760" w:hanging="360"/>
+      </w:pPr>
+      <w:rPr>
+        <w:rFonts w:ascii="Courier New" w:hAnsi="Courier New" w:cs="Courier New" w:hint="default"/>
+      </w:rPr>
+    </w:lvl>
+    <w:lvl w:ilvl="8" w:tplc="08090005" w:tentative="1">
+      <w:start w:val="1"/>
+      <w:numFmt w:val="bullet"/>
+      <w:lvlText w:val=""/>
+      <w:lvlJc w:val="left"/>
+      <w:pPr>
+        <w:ind w:left="6480" w:hanging="360"/>
+      </w:pPr>
+      <w:rPr>
+        <w:rFonts w:ascii="Wingdings" w:hAnsi="Wingdings" w:hint="default"/>
+      </w:rPr>
+    </w:lvl>
+  </w:abstractNum>
+  <w:abstractNum w:abstractNumId="16" w15:restartNumberingAfterBreak="0">
     <w:nsid w:val="5125374E"/>
     <w:multiLevelType w:val="multilevel"/>
     <w:tmpl w:val="5AAA9CA2"/>
@@ -7331,7 +8548,7 @@
       </w:rPr>
     </w:lvl>
   </w:abstractNum>
-  <w:abstractNum w:abstractNumId="13" w15:restartNumberingAfterBreak="0">
+  <w:abstractNum w:abstractNumId="17" w15:restartNumberingAfterBreak="0">
     <w:nsid w:val="53215AF0"/>
     <w:multiLevelType w:val="hybridMultilevel"/>
     <w:tmpl w:val="25324CEE"/>
@@ -7444,7 +8661,7 @@
       </w:rPr>
     </w:lvl>
   </w:abstractNum>
-  <w:abstractNum w:abstractNumId="14" w15:restartNumberingAfterBreak="0">
+  <w:abstractNum w:abstractNumId="18" w15:restartNumberingAfterBreak="0">
     <w:nsid w:val="57C60AE4"/>
     <w:multiLevelType w:val="hybridMultilevel"/>
     <w:tmpl w:val="1BC6EEB2"/>
@@ -7557,7 +8774,7 @@
       </w:rPr>
     </w:lvl>
   </w:abstractNum>
-  <w:abstractNum w:abstractNumId="15" w15:restartNumberingAfterBreak="0">
+  <w:abstractNum w:abstractNumId="19" w15:restartNumberingAfterBreak="0">
     <w:nsid w:val="584E786F"/>
     <w:multiLevelType w:val="multilevel"/>
     <w:tmpl w:val="0A082EAC"/>
@@ -7670,7 +8887,7 @@
       </w:rPr>
     </w:lvl>
   </w:abstractNum>
-  <w:abstractNum w:abstractNumId="16" w15:restartNumberingAfterBreak="0">
+  <w:abstractNum w:abstractNumId="20" w15:restartNumberingAfterBreak="0">
     <w:nsid w:val="58A50CA8"/>
     <w:multiLevelType w:val="multilevel"/>
     <w:tmpl w:val="08090021"/>
@@ -7783,7 +9000,93 @@
       </w:rPr>
     </w:lvl>
   </w:abstractNum>
-  <w:abstractNum w:abstractNumId="17" w15:restartNumberingAfterBreak="0">
+  <w:abstractNum w:abstractNumId="21" w15:restartNumberingAfterBreak="0">
+    <w:nsid w:val="5E691EA5"/>
+    <w:multiLevelType w:val="hybridMultilevel"/>
+    <w:tmpl w:val="B4D4C8B0"/>
+    <w:lvl w:ilvl="0" w:tplc="0809000F">
+      <w:start w:val="1"/>
+      <w:numFmt w:val="decimal"/>
+      <w:lvlText w:val="%1."/>
+      <w:lvlJc w:val="left"/>
+      <w:pPr>
+        <w:ind w:left="720" w:hanging="360"/>
+      </w:pPr>
+    </w:lvl>
+    <w:lvl w:ilvl="1" w:tplc="08090019" w:tentative="1">
+      <w:start w:val="1"/>
+      <w:numFmt w:val="lowerLetter"/>
+      <w:lvlText w:val="%2."/>
+      <w:lvlJc w:val="left"/>
+      <w:pPr>
+        <w:ind w:left="1440" w:hanging="360"/>
+      </w:pPr>
+    </w:lvl>
+    <w:lvl w:ilvl="2" w:tplc="0809001B" w:tentative="1">
+      <w:start w:val="1"/>
+      <w:numFmt w:val="lowerRoman"/>
+      <w:lvlText w:val="%3."/>
+      <w:lvlJc w:val="right"/>
+      <w:pPr>
+        <w:ind w:left="2160" w:hanging="180"/>
+      </w:pPr>
+    </w:lvl>
+    <w:lvl w:ilvl="3" w:tplc="0809000F" w:tentative="1">
+      <w:start w:val="1"/>
+      <w:numFmt w:val="decimal"/>
+      <w:lvlText w:val="%4."/>
+      <w:lvlJc w:val="left"/>
+      <w:pPr>
+        <w:ind w:left="2880" w:hanging="360"/>
+      </w:pPr>
+    </w:lvl>
+    <w:lvl w:ilvl="4" w:tplc="08090019" w:tentative="1">
+      <w:start w:val="1"/>
+      <w:numFmt w:val="lowerLetter"/>
+      <w:lvlText w:val="%5."/>
+      <w:lvlJc w:val="left"/>
+      <w:pPr>
+        <w:ind w:left="3600" w:hanging="360"/>
+      </w:pPr>
+    </w:lvl>
+    <w:lvl w:ilvl="5" w:tplc="0809001B" w:tentative="1">
+      <w:start w:val="1"/>
+      <w:numFmt w:val="lowerRoman"/>
+      <w:lvlText w:val="%6."/>
+      <w:lvlJc w:val="right"/>
+      <w:pPr>
+        <w:ind w:left="4320" w:hanging="180"/>
+      </w:pPr>
+    </w:lvl>
+    <w:lvl w:ilvl="6" w:tplc="0809000F" w:tentative="1">
+      <w:start w:val="1"/>
+      <w:numFmt w:val="decimal"/>
+      <w:lvlText w:val="%7."/>
+      <w:lvlJc w:val="left"/>
+      <w:pPr>
+        <w:ind w:left="5040" w:hanging="360"/>
+      </w:pPr>
+    </w:lvl>
+    <w:lvl w:ilvl="7" w:tplc="08090019" w:tentative="1">
+      <w:start w:val="1"/>
+      <w:numFmt w:val="lowerLetter"/>
+      <w:lvlText w:val="%8."/>
+      <w:lvlJc w:val="left"/>
+      <w:pPr>
+        <w:ind w:left="5760" w:hanging="360"/>
+      </w:pPr>
+    </w:lvl>
+    <w:lvl w:ilvl="8" w:tplc="0809001B" w:tentative="1">
+      <w:start w:val="1"/>
+      <w:numFmt w:val="lowerRoman"/>
+      <w:lvlText w:val="%9."/>
+      <w:lvlJc w:val="right"/>
+      <w:pPr>
+        <w:ind w:left="6480" w:hanging="180"/>
+      </w:pPr>
+    </w:lvl>
+  </w:abstractNum>
+  <w:abstractNum w:abstractNumId="22" w15:restartNumberingAfterBreak="0">
     <w:nsid w:val="655D6CC7"/>
     <w:multiLevelType w:val="hybridMultilevel"/>
     <w:tmpl w:val="BBDEACFC"/>
@@ -7896,7 +9199,7 @@
       </w:rPr>
     </w:lvl>
   </w:abstractNum>
-  <w:abstractNum w:abstractNumId="18" w15:restartNumberingAfterBreak="0">
+  <w:abstractNum w:abstractNumId="23" w15:restartNumberingAfterBreak="0">
     <w:nsid w:val="6A260D77"/>
     <w:multiLevelType w:val="multilevel"/>
     <w:tmpl w:val="C35ADCDE"/>
@@ -8009,7 +9312,7 @@
       </w:rPr>
     </w:lvl>
   </w:abstractNum>
-  <w:abstractNum w:abstractNumId="19" w15:restartNumberingAfterBreak="0">
+  <w:abstractNum w:abstractNumId="24" w15:restartNumberingAfterBreak="0">
     <w:nsid w:val="6FD33CA8"/>
     <w:multiLevelType w:val="hybridMultilevel"/>
     <w:tmpl w:val="94C0312C"/>
@@ -8122,7 +9425,7 @@
       </w:rPr>
     </w:lvl>
   </w:abstractNum>
-  <w:abstractNum w:abstractNumId="20" w15:restartNumberingAfterBreak="0">
+  <w:abstractNum w:abstractNumId="25" w15:restartNumberingAfterBreak="0">
     <w:nsid w:val="70217B03"/>
     <w:multiLevelType w:val="hybridMultilevel"/>
     <w:tmpl w:val="D0165690"/>
@@ -8235,7 +9538,7 @@
       </w:rPr>
     </w:lvl>
   </w:abstractNum>
-  <w:abstractNum w:abstractNumId="21" w15:restartNumberingAfterBreak="0">
+  <w:abstractNum w:abstractNumId="26" w15:restartNumberingAfterBreak="0">
     <w:nsid w:val="762B2AAA"/>
     <w:multiLevelType w:val="hybridMultilevel"/>
     <w:tmpl w:val="00FE61C2"/>
@@ -8348,7 +9651,7 @@
       </w:rPr>
     </w:lvl>
   </w:abstractNum>
-  <w:abstractNum w:abstractNumId="22" w15:restartNumberingAfterBreak="0">
+  <w:abstractNum w:abstractNumId="27" w15:restartNumberingAfterBreak="0">
     <w:nsid w:val="76AC035D"/>
     <w:multiLevelType w:val="multilevel"/>
     <w:tmpl w:val="040E001F"/>
@@ -8434,7 +9737,7 @@
       </w:pPr>
     </w:lvl>
   </w:abstractNum>
-  <w:abstractNum w:abstractNumId="23" w15:restartNumberingAfterBreak="0">
+  <w:abstractNum w:abstractNumId="28" w15:restartNumberingAfterBreak="0">
     <w:nsid w:val="7A032A56"/>
     <w:multiLevelType w:val="hybridMultilevel"/>
     <w:tmpl w:val="FF922A3C"/>
@@ -8521,7 +9824,7 @@
       </w:pPr>
     </w:lvl>
   </w:abstractNum>
-  <w:abstractNum w:abstractNumId="24" w15:restartNumberingAfterBreak="0">
+  <w:abstractNum w:abstractNumId="29" w15:restartNumberingAfterBreak="0">
     <w:nsid w:val="7AE02CE0"/>
     <w:multiLevelType w:val="hybridMultilevel"/>
     <w:tmpl w:val="759A32AC"/>
@@ -8634,7 +9937,7 @@
       </w:rPr>
     </w:lvl>
   </w:abstractNum>
-  <w:abstractNum w:abstractNumId="25" w15:restartNumberingAfterBreak="0">
+  <w:abstractNum w:abstractNumId="30" w15:restartNumberingAfterBreak="0">
     <w:nsid w:val="7CCF6371"/>
     <w:multiLevelType w:val="multilevel"/>
     <w:tmpl w:val="39E44950"/>
@@ -8747,7 +10050,7 @@
       </w:rPr>
     </w:lvl>
   </w:abstractNum>
-  <w:abstractNum w:abstractNumId="26" w15:restartNumberingAfterBreak="0">
+  <w:abstractNum w:abstractNumId="31" w15:restartNumberingAfterBreak="0">
     <w:nsid w:val="7CFE6FA4"/>
     <w:multiLevelType w:val="hybridMultilevel"/>
     <w:tmpl w:val="4FAE59DC"/>
@@ -8860,7 +10163,7 @@
       </w:rPr>
     </w:lvl>
   </w:abstractNum>
-  <w:abstractNum w:abstractNumId="27" w15:restartNumberingAfterBreak="0">
+  <w:abstractNum w:abstractNumId="32" w15:restartNumberingAfterBreak="0">
     <w:nsid w:val="7D4E62F3"/>
     <w:multiLevelType w:val="hybridMultilevel"/>
     <w:tmpl w:val="157E0696"/>
@@ -8974,58 +10277,58 @@
     </w:lvl>
   </w:abstractNum>
   <w:num w:numId="1" w16cid:durableId="1072653194">
-    <w:abstractNumId w:val="23"/>
+    <w:abstractNumId w:val="28"/>
   </w:num>
   <w:num w:numId="2" w16cid:durableId="482965870">
-    <w:abstractNumId w:val="8"/>
+    <w:abstractNumId w:val="10"/>
   </w:num>
   <w:num w:numId="3" w16cid:durableId="194855032">
     <w:abstractNumId w:val="0"/>
   </w:num>
   <w:num w:numId="4" w16cid:durableId="1020399097">
+    <w:abstractNumId w:val="27"/>
+  </w:num>
+  <w:num w:numId="5" w16cid:durableId="249627064">
+    <w:abstractNumId w:val="32"/>
+  </w:num>
+  <w:num w:numId="6" w16cid:durableId="1122453830">
+    <w:abstractNumId w:val="28"/>
+  </w:num>
+  <w:num w:numId="7" w16cid:durableId="261837761">
     <w:abstractNumId w:val="22"/>
   </w:num>
-  <w:num w:numId="5" w16cid:durableId="249627064">
-    <w:abstractNumId w:val="27"/>
-  </w:num>
-  <w:num w:numId="6" w16cid:durableId="1122453830">
-    <w:abstractNumId w:val="23"/>
-  </w:num>
-  <w:num w:numId="7" w16cid:durableId="261837761">
+  <w:num w:numId="8" w16cid:durableId="41683750">
     <w:abstractNumId w:val="17"/>
   </w:num>
-  <w:num w:numId="8" w16cid:durableId="41683750">
-    <w:abstractNumId w:val="13"/>
-  </w:num>
   <w:num w:numId="9" w16cid:durableId="854996144">
-    <w:abstractNumId w:val="19"/>
+    <w:abstractNumId w:val="24"/>
   </w:num>
   <w:num w:numId="10" w16cid:durableId="1938518867">
     <w:abstractNumId w:val="1"/>
   </w:num>
   <w:num w:numId="11" w16cid:durableId="1166438713">
-    <w:abstractNumId w:val="14"/>
+    <w:abstractNumId w:val="18"/>
   </w:num>
   <w:num w:numId="12" w16cid:durableId="934290815">
-    <w:abstractNumId w:val="9"/>
+    <w:abstractNumId w:val="11"/>
   </w:num>
   <w:num w:numId="13" w16cid:durableId="1212229025">
-    <w:abstractNumId w:val="16"/>
+    <w:abstractNumId w:val="20"/>
   </w:num>
   <w:num w:numId="14" w16cid:durableId="254292866">
     <w:abstractNumId w:val="3"/>
   </w:num>
   <w:num w:numId="15" w16cid:durableId="129052550">
-    <w:abstractNumId w:val="7"/>
+    <w:abstractNumId w:val="9"/>
   </w:num>
   <w:num w:numId="16" w16cid:durableId="185872029">
-    <w:abstractNumId w:val="15"/>
+    <w:abstractNumId w:val="19"/>
   </w:num>
   <w:num w:numId="17" w16cid:durableId="1593053616">
     <w:abstractNumId w:val="2"/>
   </w:num>
   <w:num w:numId="18" w16cid:durableId="1059592351">
-    <w:abstractNumId w:val="12"/>
+    <w:abstractNumId w:val="16"/>
   </w:num>
   <w:num w:numId="19" w16cid:durableId="291207590">
     <w:abstractNumId w:val="6"/>
@@ -9034,76 +10337,94 @@
     <w:abstractNumId w:val="4"/>
   </w:num>
   <w:num w:numId="21" w16cid:durableId="802651089">
-    <w:abstractNumId w:val="18"/>
+    <w:abstractNumId w:val="23"/>
   </w:num>
   <w:num w:numId="22" w16cid:durableId="872814827">
-    <w:abstractNumId w:val="11"/>
+    <w:abstractNumId w:val="14"/>
   </w:num>
   <w:num w:numId="23" w16cid:durableId="784498480">
+    <w:abstractNumId w:val="30"/>
+  </w:num>
+  <w:num w:numId="24" w16cid:durableId="1476557639">
+    <w:abstractNumId w:val="28"/>
+  </w:num>
+  <w:num w:numId="25" w16cid:durableId="975572787">
+    <w:abstractNumId w:val="28"/>
+  </w:num>
+  <w:num w:numId="26" w16cid:durableId="403189569">
+    <w:abstractNumId w:val="28"/>
+  </w:num>
+  <w:num w:numId="27" w16cid:durableId="1472289564">
+    <w:abstractNumId w:val="28"/>
+  </w:num>
+  <w:num w:numId="28" w16cid:durableId="1406029115">
+    <w:abstractNumId w:val="28"/>
+  </w:num>
+  <w:num w:numId="29" w16cid:durableId="120419030">
+    <w:abstractNumId w:val="28"/>
+  </w:num>
+  <w:num w:numId="30" w16cid:durableId="827592716">
+    <w:abstractNumId w:val="28"/>
+  </w:num>
+  <w:num w:numId="31" w16cid:durableId="1219321316">
+    <w:abstractNumId w:val="28"/>
+  </w:num>
+  <w:num w:numId="32" w16cid:durableId="1433666056">
+    <w:abstractNumId w:val="28"/>
+  </w:num>
+  <w:num w:numId="33" w16cid:durableId="498930067">
+    <w:abstractNumId w:val="28"/>
+  </w:num>
+  <w:num w:numId="34" w16cid:durableId="1853254970">
+    <w:abstractNumId w:val="28"/>
+  </w:num>
+  <w:num w:numId="35" w16cid:durableId="567421967">
+    <w:abstractNumId w:val="31"/>
+  </w:num>
+  <w:num w:numId="36" w16cid:durableId="933904821">
+    <w:abstractNumId w:val="28"/>
+  </w:num>
+  <w:num w:numId="37" w16cid:durableId="1933388568">
+    <w:abstractNumId w:val="29"/>
+  </w:num>
+  <w:num w:numId="38" w16cid:durableId="939795394">
     <w:abstractNumId w:val="25"/>
   </w:num>
-  <w:num w:numId="24" w16cid:durableId="1476557639">
-    <w:abstractNumId w:val="23"/>
-  </w:num>
-  <w:num w:numId="25" w16cid:durableId="975572787">
-    <w:abstractNumId w:val="23"/>
-  </w:num>
-  <w:num w:numId="26" w16cid:durableId="403189569">
-    <w:abstractNumId w:val="23"/>
-  </w:num>
-  <w:num w:numId="27" w16cid:durableId="1472289564">
-    <w:abstractNumId w:val="23"/>
-  </w:num>
-  <w:num w:numId="28" w16cid:durableId="1406029115">
-    <w:abstractNumId w:val="23"/>
-  </w:num>
-  <w:num w:numId="29" w16cid:durableId="120419030">
-    <w:abstractNumId w:val="23"/>
-  </w:num>
-  <w:num w:numId="30" w16cid:durableId="827592716">
-    <w:abstractNumId w:val="23"/>
-  </w:num>
-  <w:num w:numId="31" w16cid:durableId="1219321316">
-    <w:abstractNumId w:val="23"/>
-  </w:num>
-  <w:num w:numId="32" w16cid:durableId="1433666056">
-    <w:abstractNumId w:val="23"/>
-  </w:num>
-  <w:num w:numId="33" w16cid:durableId="498930067">
-    <w:abstractNumId w:val="23"/>
-  </w:num>
-  <w:num w:numId="34" w16cid:durableId="1853254970">
-    <w:abstractNumId w:val="23"/>
-  </w:num>
-  <w:num w:numId="35" w16cid:durableId="567421967">
-    <w:abstractNumId w:val="26"/>
-  </w:num>
-  <w:num w:numId="36" w16cid:durableId="933904821">
-    <w:abstractNumId w:val="23"/>
-  </w:num>
-  <w:num w:numId="37" w16cid:durableId="1933388568">
-    <w:abstractNumId w:val="24"/>
-  </w:num>
-  <w:num w:numId="38" w16cid:durableId="939795394">
-    <w:abstractNumId w:val="20"/>
-  </w:num>
   <w:num w:numId="39" w16cid:durableId="381439970">
-    <w:abstractNumId w:val="23"/>
+    <w:abstractNumId w:val="28"/>
   </w:num>
   <w:num w:numId="40" w16cid:durableId="1630934961">
     <w:abstractNumId w:val="5"/>
   </w:num>
   <w:num w:numId="41" w16cid:durableId="2055494459">
-    <w:abstractNumId w:val="10"/>
+    <w:abstractNumId w:val="12"/>
   </w:num>
   <w:num w:numId="42" w16cid:durableId="284579778">
-    <w:abstractNumId w:val="23"/>
+    <w:abstractNumId w:val="28"/>
   </w:num>
   <w:num w:numId="43" w16cid:durableId="177549464">
+    <w:abstractNumId w:val="26"/>
+  </w:num>
+  <w:num w:numId="44" w16cid:durableId="1911429203">
+    <w:abstractNumId w:val="28"/>
+  </w:num>
+  <w:num w:numId="45" w16cid:durableId="1534532811">
+    <w:abstractNumId w:val="28"/>
+  </w:num>
+  <w:num w:numId="46" w16cid:durableId="150148044">
+    <w:abstractNumId w:val="8"/>
+  </w:num>
+  <w:num w:numId="47" w16cid:durableId="931427050">
+    <w:abstractNumId w:val="15"/>
+  </w:num>
+  <w:num w:numId="48" w16cid:durableId="98067151">
     <w:abstractNumId w:val="21"/>
   </w:num>
-  <w:num w:numId="44" w16cid:durableId="1911429203">
-    <w:abstractNumId w:val="23"/>
+  <w:num w:numId="49" w16cid:durableId="1725988336">
+    <w:abstractNumId w:val="13"/>
+  </w:num>
+  <w:num w:numId="50" w16cid:durableId="689993573">
+    <w:abstractNumId w:val="7"/>
   </w:num>
   <w:numIdMacAtCleanup w:val="5"/>
 </w:numbering>
@@ -9592,7 +10913,6 @@
   <w:style w:type="character" w:default="1" w:styleId="DefaultParagraphFont">
     <w:name w:val="Default Paragraph Font"/>
     <w:uiPriority w:val="1"/>
-    <w:semiHidden/>
     <w:unhideWhenUsed/>
   </w:style>
   <w:style w:type="table" w:default="1" w:styleId="TableNormal">
@@ -10038,14 +11358,19 @@
 </file>
 
 <file path=customXml/item1.xml><?xml version="1.0" encoding="utf-8"?>
-<p:properties xmlns:p="http://schemas.microsoft.com/office/2006/metadata/properties" xmlns:xsi="http://www.w3.org/2001/XMLSchema-instance" xmlns:pc="http://schemas.microsoft.com/office/infopath/2007/PartnerControls">
-  <documentManagement>
-    <ReferenceId xmlns="3082a470-ada5-4cbf-9d06-ea7467a5f42b" xsi:nil="true"/>
-  </documentManagement>
-</p:properties>
+<b:Sources xmlns:b="http://schemas.openxmlformats.org/officeDocument/2006/bibliography" xmlns="http://schemas.openxmlformats.org/officeDocument/2006/bibliography" SelectedStyle="\APASixthEditionOfficeOnline.xsl" StyleName="APA" Version="6"/>
 </file>
 
 <file path=customXml/item2.xml><?xml version="1.0" encoding="utf-8"?>
+<?mso-contentType ?>
+<FormTemplates xmlns="http://schemas.microsoft.com/sharepoint/v3/contenttype/forms">
+  <Display>DocumentLibraryForm</Display>
+  <Edit>DocumentLibraryForm</Edit>
+  <New>DocumentLibraryForm</New>
+</FormTemplates>
+</file>
+
+<file path=customXml/item3.xml><?xml version="1.0" encoding="utf-8"?>
 <ct:contentTypeSchema xmlns:ct="http://schemas.microsoft.com/office/2006/metadata/contentType" xmlns:ma="http://schemas.microsoft.com/office/2006/metadata/properties/metaAttributes" ct:_="" ma:_="" ma:contentTypeName="Dokumentum" ma:contentTypeID="0x0101008DB2BA77D7B0974F81E40FCB12FBB0F7" ma:contentTypeVersion="1" ma:contentTypeDescription="Új dokumentum létrehozása." ma:contentTypeScope="" ma:versionID="a2fe183413a33cc8dafe865f56a242a7">
   <xsd:schema xmlns:xsd="http://www.w3.org/2001/XMLSchema" xmlns:xs="http://www.w3.org/2001/XMLSchema" xmlns:p="http://schemas.microsoft.com/office/2006/metadata/properties" xmlns:ns2="3082a470-ada5-4cbf-9d06-ea7467a5f42b" targetNamespace="http://schemas.microsoft.com/office/2006/metadata/properties" ma:root="true" ma:fieldsID="e8e075e40068dd2fe6b5652315bdd1b1" ns2:_="">
     <xsd:import namespace="3082a470-ada5-4cbf-9d06-ea7467a5f42b"/>
@@ -10171,30 +11496,31 @@
 </ct:contentTypeSchema>
 </file>
 
-<file path=customXml/item3.xml><?xml version="1.0" encoding="utf-8"?>
-<?mso-contentType ?>
-<FormTemplates xmlns="http://schemas.microsoft.com/sharepoint/v3/contenttype/forms">
-  <Display>DocumentLibraryForm</Display>
-  <Edit>DocumentLibraryForm</Edit>
-  <New>DocumentLibraryForm</New>
-</FormTemplates>
-</file>
-
 <file path=customXml/item4.xml><?xml version="1.0" encoding="utf-8"?>
-<b:Sources xmlns:b="http://schemas.openxmlformats.org/officeDocument/2006/bibliography" xmlns="http://schemas.openxmlformats.org/officeDocument/2006/bibliography" SelectedStyle="\APASixthEditionOfficeOnline.xsl" StyleName="APA" Version="6"/>
+<p:properties xmlns:p="http://schemas.microsoft.com/office/2006/metadata/properties" xmlns:xsi="http://www.w3.org/2001/XMLSchema-instance" xmlns:pc="http://schemas.microsoft.com/office/infopath/2007/PartnerControls">
+  <documentManagement>
+    <ReferenceId xmlns="3082a470-ada5-4cbf-9d06-ea7467a5f42b" xsi:nil="true"/>
+  </documentManagement>
+</p:properties>
 </file>
 
 <file path=customXml/itemProps1.xml><?xml version="1.0" encoding="utf-8"?>
-<ds:datastoreItem xmlns:ds="http://schemas.openxmlformats.org/officeDocument/2006/customXml" ds:itemID="{B7E9051D-122B-41E4-9B50-07EAFD04DFCF}">
+<ds:datastoreItem xmlns:ds="http://schemas.openxmlformats.org/officeDocument/2006/customXml" ds:itemID="{E046164B-1B66-4EDD-8209-A45E9B93A194}">
   <ds:schemaRefs>
-    <ds:schemaRef ds:uri="http://schemas.microsoft.com/office/2006/metadata/properties"/>
-    <ds:schemaRef ds:uri="http://schemas.microsoft.com/office/infopath/2007/PartnerControls"/>
-    <ds:schemaRef ds:uri="3082a470-ada5-4cbf-9d06-ea7467a5f42b"/>
+    <ds:schemaRef ds:uri="http://schemas.openxmlformats.org/officeDocument/2006/bibliography"/>
   </ds:schemaRefs>
 </ds:datastoreItem>
 </file>
 
 <file path=customXml/itemProps2.xml><?xml version="1.0" encoding="utf-8"?>
+<ds:datastoreItem xmlns:ds="http://schemas.openxmlformats.org/officeDocument/2006/customXml" ds:itemID="{79A7C881-0E9F-4ADE-9952-CE895C263EC3}">
+  <ds:schemaRefs>
+    <ds:schemaRef ds:uri="http://schemas.microsoft.com/sharepoint/v3/contenttype/forms"/>
+  </ds:schemaRefs>
+</ds:datastoreItem>
+</file>
+
+<file path=customXml/itemProps3.xml><?xml version="1.0" encoding="utf-8"?>
 <ds:datastoreItem xmlns:ds="http://schemas.openxmlformats.org/officeDocument/2006/customXml" ds:itemID="{C926E1C3-1EDF-4BDB-98CD-6269B8457C24}">
   <ds:schemaRefs>
     <ds:schemaRef ds:uri="http://schemas.microsoft.com/office/2006/metadata/contentType"/>
@@ -10212,18 +11538,12 @@
 </ds:datastoreItem>
 </file>
 
-<file path=customXml/itemProps3.xml><?xml version="1.0" encoding="utf-8"?>
-<ds:datastoreItem xmlns:ds="http://schemas.openxmlformats.org/officeDocument/2006/customXml" ds:itemID="{79A7C881-0E9F-4ADE-9952-CE895C263EC3}">
+<file path=customXml/itemProps4.xml><?xml version="1.0" encoding="utf-8"?>
+<ds:datastoreItem xmlns:ds="http://schemas.openxmlformats.org/officeDocument/2006/customXml" ds:itemID="{B7E9051D-122B-41E4-9B50-07EAFD04DFCF}">
   <ds:schemaRefs>
-    <ds:schemaRef ds:uri="http://schemas.microsoft.com/sharepoint/v3/contenttype/forms"/>
-  </ds:schemaRefs>
-</ds:datastoreItem>
-</file>
-
-<file path=customXml/itemProps4.xml><?xml version="1.0" encoding="utf-8"?>
-<ds:datastoreItem xmlns:ds="http://schemas.openxmlformats.org/officeDocument/2006/customXml" ds:itemID="{E046164B-1B66-4EDD-8209-A45E9B93A194}">
-  <ds:schemaRefs>
-    <ds:schemaRef ds:uri="http://schemas.openxmlformats.org/officeDocument/2006/bibliography"/>
+    <ds:schemaRef ds:uri="http://schemas.microsoft.com/office/2006/metadata/properties"/>
+    <ds:schemaRef ds:uri="http://schemas.microsoft.com/office/infopath/2007/PartnerControls"/>
+    <ds:schemaRef ds:uri="3082a470-ada5-4cbf-9d06-ea7467a5f42b"/>
   </ds:schemaRefs>
 </ds:datastoreItem>
 </file>
</xml_diff>